<commit_message>
fix: work on ABCDE trigger points
</commit_message>
<xml_diff>
--- a/docs/mani-client-meeting-2026-10-02.docx
+++ b/docs/mani-client-meeting-2026-10-02.docx
@@ -365,7 +365,7 @@
           <w:sz w:val="22"/>
           <w:szCs w:val="22"/>
         </w:rPr>
-        <w:t xml:space="preserve">Over the last seven pull requests we reworked parts that were not good enough in real trials. Each row is a change made because the first version did not hold up.</w:t>
+        <w:t xml:space="preserve">Over the last seven pull requests (#10 to #16) we reworked parts that were not good enough in real trials. Each row is a change made because the first version did not hold up.</w:t>
       </w:r>
     </w:p>
     <w:tbl>
@@ -452,6 +452,9 @@
         </w:tc>
       </w:tr>
       <w:tr>
+        <w:trPr>
+          <w:cantSplit/>
+        </w:trPr>
         <w:tc>
           <w:tcPr>
             <w:tcW w:type="dxa" w:w="2300"/>
@@ -468,6 +471,18 @@
               <w:right w:type="dxa" w:w="120"/>
             </w:tcMar>
           </w:tcPr>
+          <w:p>
+            <w:r>
+              <w:rPr>
+                <w:rFonts w:ascii="Calibri" w:cs="Calibri" w:eastAsia="Calibri" w:hAnsi="Calibri"/>
+                <w:b/>
+                <w:bCs/>
+                <w:sz w:val="21"/>
+                <w:szCs w:val="21"/>
+              </w:rPr>
+              <w:t xml:space="preserve">#10  29 Sep</w:t>
+            </w:r>
+          </w:p>
           <w:p>
             <w:r>
               <w:rPr>
@@ -477,8 +492,7 @@
                 <w:sz w:val="21"/>
                 <w:szCs w:val="21"/>
               </w:rPr>
-              <w:t xml:space="preserve">#10  28 Sep
-Body close-out and tone</w:t>
+              <w:t xml:space="preserve">Body close-out and tone</w:t>
             </w:r>
           </w:p>
         </w:tc>
@@ -513,6 +527,9 @@
         </w:tc>
       </w:tr>
       <w:tr>
+        <w:trPr>
+          <w:cantSplit/>
+        </w:trPr>
         <w:tc>
           <w:tcPr>
             <w:tcW w:type="dxa" w:w="2300"/>
@@ -529,6 +546,18 @@
               <w:right w:type="dxa" w:w="120"/>
             </w:tcMar>
           </w:tcPr>
+          <w:p>
+            <w:r>
+              <w:rPr>
+                <w:rFonts w:ascii="Calibri" w:cs="Calibri" w:eastAsia="Calibri" w:hAnsi="Calibri"/>
+                <w:b/>
+                <w:bCs/>
+                <w:sz w:val="21"/>
+                <w:szCs w:val="21"/>
+              </w:rPr>
+              <w:t xml:space="preserve">#11 and #12  29 Sep</w:t>
+            </w:r>
+          </w:p>
           <w:p>
             <w:r>
               <w:rPr>
@@ -538,8 +567,7 @@
                 <w:sz w:val="21"/>
                 <w:szCs w:val="21"/>
               </w:rPr>
-              <w:t xml:space="preserve">#11 and #12  29 Sep
-Model changes</w:t>
+              <w:t xml:space="preserve">Model changes</w:t>
             </w:r>
           </w:p>
         </w:tc>
@@ -574,6 +602,9 @@
         </w:tc>
       </w:tr>
       <w:tr>
+        <w:trPr>
+          <w:cantSplit/>
+        </w:trPr>
         <w:tc>
           <w:tcPr>
             <w:tcW w:type="dxa" w:w="2300"/>
@@ -590,6 +621,18 @@
               <w:right w:type="dxa" w:w="120"/>
             </w:tcMar>
           </w:tcPr>
+          <w:p>
+            <w:r>
+              <w:rPr>
+                <w:rFonts w:ascii="Calibri" w:cs="Calibri" w:eastAsia="Calibri" w:hAnsi="Calibri"/>
+                <w:b/>
+                <w:bCs/>
+                <w:sz w:val="21"/>
+                <w:szCs w:val="21"/>
+              </w:rPr>
+              <w:t xml:space="preserve">#13  29 Sep</w:t>
+            </w:r>
+          </w:p>
           <w:p>
             <w:r>
               <w:rPr>
@@ -599,8 +642,7 @@
                 <w:sz w:val="21"/>
                 <w:szCs w:val="21"/>
               </w:rPr>
-              <w:t xml:space="preserve">#13  29 Sep
-Quality of questions</w:t>
+              <w:t xml:space="preserve">Quality of questions</w:t>
             </w:r>
           </w:p>
         </w:tc>
@@ -635,6 +677,9 @@
         </w:tc>
       </w:tr>
       <w:tr>
+        <w:trPr>
+          <w:cantSplit/>
+        </w:trPr>
         <w:tc>
           <w:tcPr>
             <w:tcW w:type="dxa" w:w="2300"/>
@@ -651,6 +696,18 @@
               <w:right w:type="dxa" w:w="120"/>
             </w:tcMar>
           </w:tcPr>
+          <w:p>
+            <w:r>
+              <w:rPr>
+                <w:rFonts w:ascii="Calibri" w:cs="Calibri" w:eastAsia="Calibri" w:hAnsi="Calibri"/>
+                <w:b/>
+                <w:bCs/>
+                <w:sz w:val="21"/>
+                <w:szCs w:val="21"/>
+              </w:rPr>
+              <w:t xml:space="preserve">#14  29 Sep</w:t>
+            </w:r>
+          </w:p>
           <w:p>
             <w:r>
               <w:rPr>
@@ -660,8 +717,7 @@
                 <w:sz w:val="21"/>
                 <w:szCs w:val="21"/>
               </w:rPr>
-              <w:t xml:space="preserve">#14  29 Sep
-Safety lock</w:t>
+              <w:t xml:space="preserve">Safety lock</w:t>
             </w:r>
           </w:p>
         </w:tc>
@@ -696,6 +752,9 @@
         </w:tc>
       </w:tr>
       <w:tr>
+        <w:trPr>
+          <w:cantSplit/>
+        </w:trPr>
         <w:tc>
           <w:tcPr>
             <w:tcW w:type="dxa" w:w="2300"/>
@@ -712,6 +771,18 @@
               <w:right w:type="dxa" w:w="120"/>
             </w:tcMar>
           </w:tcPr>
+          <w:p>
+            <w:r>
+              <w:rPr>
+                <w:rFonts w:ascii="Calibri" w:cs="Calibri" w:eastAsia="Calibri" w:hAnsi="Calibri"/>
+                <w:b/>
+                <w:bCs/>
+                <w:sz w:val="21"/>
+                <w:szCs w:val="21"/>
+              </w:rPr>
+              <w:t xml:space="preserve">#15  1 Oct</w:t>
+            </w:r>
+          </w:p>
           <w:p>
             <w:r>
               <w:rPr>
@@ -721,8 +792,7 @@
                 <w:sz w:val="21"/>
                 <w:szCs w:val="21"/>
               </w:rPr>
-              <w:t xml:space="preserve">#15  1 Oct
-Voice input</w:t>
+              <w:t xml:space="preserve">Voice input</w:t>
             </w:r>
           </w:p>
         </w:tc>
@@ -757,6 +827,9 @@
         </w:tc>
       </w:tr>
       <w:tr>
+        <w:trPr>
+          <w:cantSplit/>
+        </w:trPr>
         <w:tc>
           <w:tcPr>
             <w:tcW w:type="dxa" w:w="2300"/>
@@ -773,6 +846,18 @@
               <w:right w:type="dxa" w:w="120"/>
             </w:tcMar>
           </w:tcPr>
+          <w:p>
+            <w:r>
+              <w:rPr>
+                <w:rFonts w:ascii="Calibri" w:cs="Calibri" w:eastAsia="Calibri" w:hAnsi="Calibri"/>
+                <w:b/>
+                <w:bCs/>
+                <w:sz w:val="21"/>
+                <w:szCs w:val="21"/>
+              </w:rPr>
+              <w:t xml:space="preserve">#16  2 Oct</w:t>
+            </w:r>
+          </w:p>
           <w:p>
             <w:r>
               <w:rPr>
@@ -782,8 +867,7 @@
                 <w:sz w:val="21"/>
                 <w:szCs w:val="21"/>
               </w:rPr>
-              <w:t xml:space="preserve">#16  1–2 Oct
-Framework content and triggering</w:t>
+              <w:t xml:space="preserve">Frameworks, offers and routing</w:t>
             </w:r>
           </w:p>
         </w:tc>
@@ -812,12 +896,15 @@
                 <w:sz w:val="21"/>
                 <w:szCs w:val="21"/>
               </w:rPr>
-              <w:t xml:space="preserve">Framework files revised against your specifications, and the rules for when a framework is offered tightened. A confident offer can come from the second message (third for ABCDE, Thought Reframe and ACT), and the closest fit is owed by the fourth.</w:t>
+              <w:t xml:space="preserve">The largest rework. All six framework files and MANI’s core prompts were rewritten against your specifications. Offers now follow MANI’s own confidence: a clear fit can be offered from the person’s second message (third for ABCDE, Thought Reframe and ACT), and if nothing has been offered by the fourth, the closest fit is offered with “Keep chatting” beside it. Framework choice from the person’s words was sharpened, including a rule to offer ABCDE when someone asks to understand why something affected them, and phrases that rule a framework out (for example grief wording ruling out Behavioral Activation). MANI now recognises vague answers, “I already told you”, and “I just need to vent”, and responds to each. Indirect crisis wording such as “pills in my hand” now pauses frameworks without locking the chat.</w:t>
             </w:r>
           </w:p>
         </w:tc>
       </w:tr>
       <w:tr>
+        <w:trPr>
+          <w:cantSplit/>
+        </w:trPr>
         <w:tc>
           <w:tcPr>
             <w:tcW w:type="dxa" w:w="2300"/>
@@ -834,6 +921,18 @@
               <w:right w:type="dxa" w:w="120"/>
             </w:tcMar>
           </w:tcPr>
+          <w:p>
+            <w:r>
+              <w:rPr>
+                <w:rFonts w:ascii="Calibri" w:cs="Calibri" w:eastAsia="Calibri" w:hAnsi="Calibri"/>
+                <w:b/>
+                <w:bCs/>
+                <w:sz w:val="21"/>
+                <w:szCs w:val="21"/>
+              </w:rPr>
+              <w:t xml:space="preserve">In progress  2 Oct</w:t>
+            </w:r>
+          </w:p>
           <w:p>
             <w:r>
               <w:rPr>
@@ -843,8 +942,7 @@
                 <w:sz w:val="21"/>
                 <w:szCs w:val="21"/>
               </w:rPr>
-              <w:t xml:space="preserve">In progress  2 Oct
-Body route, from your latest flow</w:t>
+              <w:t xml:space="preserve">Body route, from your latest flow</w:t>
             </w:r>
           </w:p>
         </w:tc>
@@ -1141,6 +1239,9 @@
         </w:tc>
       </w:tr>
       <w:tr>
+        <w:trPr>
+          <w:cantSplit/>
+        </w:trPr>
         <w:tc>
           <w:tcPr>
             <w:tcW w:type="dxa" w:w="2300"/>
@@ -1201,6 +1302,9 @@
         </w:tc>
       </w:tr>
       <w:tr>
+        <w:trPr>
+          <w:cantSplit/>
+        </w:trPr>
         <w:tc>
           <w:tcPr>
             <w:tcW w:type="dxa" w:w="2300"/>
@@ -1261,6 +1365,9 @@
         </w:tc>
       </w:tr>
       <w:tr>
+        <w:trPr>
+          <w:cantSplit/>
+        </w:trPr>
         <w:tc>
           <w:tcPr>
             <w:tcW w:type="dxa" w:w="2300"/>
@@ -1321,6 +1428,9 @@
         </w:tc>
       </w:tr>
       <w:tr>
+        <w:trPr>
+          <w:cantSplit/>
+        </w:trPr>
         <w:tc>
           <w:tcPr>
             <w:tcW w:type="dxa" w:w="2300"/>
@@ -1381,6 +1491,9 @@
         </w:tc>
       </w:tr>
       <w:tr>
+        <w:trPr>
+          <w:cantSplit/>
+        </w:trPr>
         <w:tc>
           <w:tcPr>
             <w:tcW w:type="dxa" w:w="2300"/>
@@ -1441,6 +1554,9 @@
         </w:tc>
       </w:tr>
       <w:tr>
+        <w:trPr>
+          <w:cantSplit/>
+        </w:trPr>
         <w:tc>
           <w:tcPr>
             <w:tcW w:type="dxa" w:w="2300"/>
@@ -1501,6 +1617,9 @@
         </w:tc>
       </w:tr>
       <w:tr>
+        <w:trPr>
+          <w:cantSplit/>
+        </w:trPr>
         <w:tc>
           <w:tcPr>
             <w:tcW w:type="dxa" w:w="2300"/>

</xml_diff>